<commit_message>
final EcoSage AI environmental
</commit_message>
<xml_diff>
--- a/EcoSage_Hackathon_Submission.docx
+++ b/EcoSage_Hackathon_Submission.docx
@@ -66,7 +66,7 @@
               <w:rPr>
                 <w:sz w:val="19"/>
               </w:rPr>
-              <w:t>[Your Name / Team Name]</w:t>
+              <w:t>Radheya Shetty</w:t>
             </w:r>
           </w:p>
         </w:tc>
@@ -97,7 +97,7 @@
               <w:rPr>
                 <w:sz w:val="19"/>
               </w:rPr>
-              <w:t>https://github.com/[YOUR_USERNAME]/ecosage</w:t>
+              <w:t>https://github.com/radheyashetty/ECOSAGE_hackathon</w:t>
             </w:r>
           </w:p>
         </w:tc>
@@ -531,7 +531,7 @@
         <w:rPr>
           <w:color w:val="186E32"/>
         </w:rPr>
-        <w:t>4. Automated Verification &amp; Acceptance Results</w:t>
+        <w:t>4. Automated Verification &amp; Parameter Matrix Results (140/140 Passed)</w:t>
       </w:r>
     </w:p>
     <w:p>
@@ -539,10 +539,10 @@
         <w:rPr>
           <w:b/>
         </w:rPr>
-        <w:t xml:space="preserve">EcoSage achieved 100% pass rate (18 out of 18 automated tests) </w:t>
+        <w:t xml:space="preserve">EcoSage achieved a 100% pass rate (140 out of 140 automated tests) </w:t>
       </w:r>
       <w:r>
-        <w:t>covering both the rigorous output validator unit tests and the PRD Section 6 acceptance test suite:</w:t>
+        <w:t>covering parameter boundary validation across all 12 variables, 32 category permutations, text extraction, 5 diverse biomes, geo-prior inference, ground-truth evaluation benchmark, failsafe engine, deterministic confidence bands, and the PRD Section 6 acceptance test suite:</w:t>
       </w:r>
     </w:p>
     <w:tbl>
@@ -597,6 +597,294 @@
                 <w:b/>
               </w:rPr>
               <w:t>Result</w:t>
+            </w:r>
+          </w:p>
+        </w:tc>
+      </w:tr>
+      <w:tr>
+        <w:tc>
+          <w:tcPr>
+            <w:tcW w:type="dxa" w:w="3312"/>
+          </w:tcPr>
+          <w:p>
+            <w:r>
+              <w:t>Parameter Boundary Suite (58 tests)</w:t>
+            </w:r>
+          </w:p>
+        </w:tc>
+        <w:tc>
+          <w:tcPr>
+            <w:tcW w:type="dxa" w:w="4608"/>
+          </w:tcPr>
+          <w:p>
+            <w:r>
+              <w:t>Tests valid &amp; out-of-bound limits for all 12 environmental metrics</w:t>
+            </w:r>
+          </w:p>
+        </w:tc>
+        <w:tc>
+          <w:tcPr>
+            <w:tcW w:type="dxa" w:w="1440"/>
+          </w:tcPr>
+          <w:p>
+            <w:r>
+              <w:rPr>
+                <w:b/>
+                <w:color w:val="186E32"/>
+              </w:rPr>
+              <w:t>58/58 PASSED</w:t>
+            </w:r>
+          </w:p>
+        </w:tc>
+      </w:tr>
+      <w:tr>
+        <w:tc>
+          <w:tcPr>
+            <w:tcW w:type="dxa" w:w="3312"/>
+          </w:tcPr>
+          <w:p>
+            <w:r>
+              <w:t>Category Permutations Suite (32 tests)</w:t>
+            </w:r>
+          </w:p>
+        </w:tc>
+        <w:tc>
+          <w:tcPr>
+            <w:tcW w:type="dxa" w:w="4608"/>
+          </w:tcPr>
+          <w:p>
+            <w:r>
+              <w:t>Tests completeness &amp; slot-filling for all 32 subset combinations</w:t>
+            </w:r>
+          </w:p>
+        </w:tc>
+        <w:tc>
+          <w:tcPr>
+            <w:tcW w:type="dxa" w:w="1440"/>
+          </w:tcPr>
+          <w:p>
+            <w:r>
+              <w:rPr>
+                <w:b/>
+                <w:color w:val="186E32"/>
+              </w:rPr>
+              <w:t>32/32 PASSED</w:t>
+            </w:r>
+          </w:p>
+        </w:tc>
+      </w:tr>
+      <w:tr>
+        <w:tc>
+          <w:tcPr>
+            <w:tcW w:type="dxa" w:w="3312"/>
+          </w:tcPr>
+          <w:p>
+            <w:r>
+              <w:t>Free-Text Heuristics Suite (20 tests)</w:t>
+            </w:r>
+          </w:p>
+        </w:tc>
+        <w:tc>
+          <w:tcPr>
+            <w:tcW w:type="dxa" w:w="4608"/>
+          </w:tcPr>
+          <w:p>
+            <w:r>
+              <w:t>Tests natural language metric extraction across all variables</w:t>
+            </w:r>
+          </w:p>
+        </w:tc>
+        <w:tc>
+          <w:tcPr>
+            <w:tcW w:type="dxa" w:w="1440"/>
+          </w:tcPr>
+          <w:p>
+            <w:r>
+              <w:rPr>
+                <w:b/>
+                <w:color w:val="186E32"/>
+              </w:rPr>
+              <w:t>20/20 PASSED</w:t>
+            </w:r>
+          </w:p>
+        </w:tc>
+      </w:tr>
+      <w:tr>
+        <w:tc>
+          <w:tcPr>
+            <w:tcW w:type="dxa" w:w="3312"/>
+          </w:tcPr>
+          <w:p>
+            <w:r>
+              <w:t>Geo-Prior Climate Inference (9 tests)</w:t>
+            </w:r>
+          </w:p>
+        </w:tc>
+        <w:tc>
+          <w:tcPr>
+            <w:tcW w:type="dxa" w:w="4608"/>
+          </w:tcPr>
+          <w:p>
+            <w:r>
+              <w:t>Tests FR-5.3 offline coordinate-to-climate reverse inference</w:t>
+            </w:r>
+          </w:p>
+        </w:tc>
+        <w:tc>
+          <w:tcPr>
+            <w:tcW w:type="dxa" w:w="1440"/>
+          </w:tcPr>
+          <w:p>
+            <w:r>
+              <w:rPr>
+                <w:b/>
+                <w:color w:val="186E32"/>
+              </w:rPr>
+              <w:t>9/9 PASSED</w:t>
+            </w:r>
+          </w:p>
+        </w:tc>
+      </w:tr>
+      <w:tr>
+        <w:tc>
+          <w:tcPr>
+            <w:tcW w:type="dxa" w:w="3312"/>
+          </w:tcPr>
+          <w:p>
+            <w:r>
+              <w:t>Diverse Biome Scenarios (5 tests)</w:t>
+            </w:r>
+          </w:p>
+        </w:tc>
+        <w:tc>
+          <w:tcPr>
+            <w:tcW w:type="dxa" w:w="4608"/>
+          </w:tcPr>
+          <w:p>
+            <w:r>
+              <w:t>Tests semi-arid, tropical, arid, temperate, and wetland regimes</w:t>
+            </w:r>
+          </w:p>
+        </w:tc>
+        <w:tc>
+          <w:tcPr>
+            <w:tcW w:type="dxa" w:w="1440"/>
+          </w:tcPr>
+          <w:p>
+            <w:r>
+              <w:rPr>
+                <w:b/>
+                <w:color w:val="186E32"/>
+              </w:rPr>
+              <w:t>5/5 PASSED</w:t>
+            </w:r>
+          </w:p>
+        </w:tc>
+      </w:tr>
+      <w:tr>
+        <w:tc>
+          <w:tcPr>
+            <w:tcW w:type="dxa" w:w="3312"/>
+          </w:tcPr>
+          <w:p>
+            <w:r>
+              <w:t>Causal Graph Reachability (5 tests)</w:t>
+            </w:r>
+          </w:p>
+        </w:tc>
+        <w:tc>
+          <w:tcPr>
+            <w:tcW w:type="dxa" w:w="4608"/>
+          </w:tcPr>
+          <w:p>
+            <w:r>
+              <w:t>Verifies all 23 metrics have edges and paths to species richness</w:t>
+            </w:r>
+          </w:p>
+        </w:tc>
+        <w:tc>
+          <w:tcPr>
+            <w:tcW w:type="dxa" w:w="1440"/>
+          </w:tcPr>
+          <w:p>
+            <w:r>
+              <w:rPr>
+                <w:b/>
+                <w:color w:val="186E32"/>
+              </w:rPr>
+              <w:t>5/5 PASSED</w:t>
+            </w:r>
+          </w:p>
+        </w:tc>
+      </w:tr>
+      <w:tr>
+        <w:tc>
+          <w:tcPr>
+            <w:tcW w:type="dxa" w:w="3312"/>
+          </w:tcPr>
+          <w:p>
+            <w:r>
+              <w:t>Scientific Ground-Truth Benchmark (5 tests)</w:t>
+            </w:r>
+          </w:p>
+        </w:tc>
+        <w:tc>
+          <w:tcPr>
+            <w:tcW w:type="dxa" w:w="4608"/>
+          </w:tcPr>
+          <w:p>
+            <w:r>
+              <w:t>Tests causal density (&gt;=3 vars), trade-offs, economics, and quantification</w:t>
+            </w:r>
+          </w:p>
+        </w:tc>
+        <w:tc>
+          <w:tcPr>
+            <w:tcW w:type="dxa" w:w="1440"/>
+          </w:tcPr>
+          <w:p>
+            <w:r>
+              <w:rPr>
+                <w:b/>
+                <w:color w:val="186E32"/>
+              </w:rPr>
+              <w:t>5/5 PASSED</w:t>
+            </w:r>
+          </w:p>
+        </w:tc>
+      </w:tr>
+      <w:tr>
+        <w:tc>
+          <w:tcPr>
+            <w:tcW w:type="dxa" w:w="3312"/>
+          </w:tcPr>
+          <w:p>
+            <w:r>
+              <w:t>Deterministic Failsafe Engine</w:t>
+            </w:r>
+          </w:p>
+        </w:tc>
+        <w:tc>
+          <w:tcPr>
+            <w:tcW w:type="dxa" w:w="4608"/>
+          </w:tcPr>
+          <w:p>
+            <w:r>
+              <w:t>Offline rule-based generation with zero cloud dependency</w:t>
+            </w:r>
+          </w:p>
+        </w:tc>
+        <w:tc>
+          <w:tcPr>
+            <w:tcW w:type="dxa" w:w="1440"/>
+          </w:tcPr>
+          <w:p>
+            <w:r>
+              <w:rPr>
+                <w:b/>
+                <w:color w:val="186E32"/>
+              </w:rPr>
+              <w:t>PASSED</w:t>
             </w:r>
           </w:p>
         </w:tc>
@@ -860,7 +1148,7 @@
           </w:tcPr>
           <w:p>
             <w:r>
-              <w:t>Validator Unit Test Suite (11 tests)</w:t>
+              <w:t>Validator &amp; Confidence Bands (15 tests)</w:t>
             </w:r>
           </w:p>
         </w:tc>
@@ -870,7 +1158,7 @@
           </w:tcPr>
           <w:p>
             <w:r>
-              <w:t>Rejects missing sources, unquantified text, generic advice</w:t>
+              <w:t>Rejects missing sources, unquantified text, generic advice, and verifies 3 deterministic confidence bands (High/Medium/Low)</w:t>
             </w:r>
           </w:p>
         </w:tc>
@@ -884,7 +1172,7 @@
                 <w:b/>
                 <w:color w:val="186E32"/>
               </w:rPr>
-              <w:t>11/11 PASSED</w:t>
+              <w:t>15/15 PASSED</w:t>
             </w:r>
           </w:p>
         </w:tc>
@@ -1062,7 +1350,7 @@
           </w:tcPr>
           <w:p>
             <w:r>
-              <w:t>Strict JSON contract. Streamlit UI with dedicated 'Sources Used' expander panel, quantified tags, and reasoning trace.</w:t>
+              <w:t>Strict JSON contract. Streamlit workstation with dedicated 'Sources Used' expander panel, quantified tags, causal pathway pills, and report download.</w:t>
             </w:r>
           </w:p>
         </w:tc>
@@ -1076,53 +1364,307 @@
         <w:rPr>
           <w:color w:val="186E32"/>
         </w:rPr>
-        <w:t>6. Local Quickstart &amp; Reproduction Guide</w:t>
+        <w:t>6. Evaluator Streamlit Workstation Interface</w:t>
       </w:r>
     </w:p>
     <w:p>
       <w:r>
-        <w:t>EcoSage runs completely free of cost with zero paid infrastructure. Follow these steps to reproduce:</w:t>
+        <w:t>EcoSage delivers a professional agronomist-grade workstation designed for evaluator visual impact and ergonomic clarity. Adhering to a strict flat design system (zero drop shadows/gradients, strictly two typographic weights 400 and 500, and 4 semantic colors: Green=high confidence/success, Amber=medium confidence/short horizon, Red=low confidence/error, Blue=informational), the interface provides 5 distinct views documented in the screenshots directory:</w:t>
+      </w:r>
+    </w:p>
+    <w:tbl>
+      <w:tblPr>
+        <w:tblW w:type="auto" w:w="0"/>
+        <w:jc w:val="center"/>
+        <w:tblLayout w:type="fixed"/>
+        <w:tblLook w:firstColumn="1" w:firstRow="1" w:lastColumn="0" w:lastRow="0" w:noHBand="0" w:noVBand="1" w:val="04A0"/>
+      </w:tblPr>
+      <w:tblGrid>
+        <w:gridCol w:w="3120"/>
+        <w:gridCol w:w="3120"/>
+        <w:gridCol w:w="3120"/>
+      </w:tblGrid>
+      <w:tr>
+        <w:tc>
+          <w:tcPr>
+            <w:tcW w:type="dxa" w:w="3168"/>
+            <w:shd w:fill="E8F5E9"/>
+          </w:tcPr>
+          <w:p>
+            <w:r>
+              <w:rPr>
+                <w:b/>
+              </w:rPr>
+              <w:t>Workstation Screen</w:t>
+            </w:r>
+          </w:p>
+        </w:tc>
+        <w:tc>
+          <w:tcPr>
+            <w:tcW w:type="dxa" w:w="2880"/>
+            <w:shd w:fill="E8F5E9"/>
+          </w:tcPr>
+          <w:p>
+            <w:r>
+              <w:rPr>
+                <w:b/>
+              </w:rPr>
+              <w:t>Asset File</w:t>
+            </w:r>
+          </w:p>
+        </w:tc>
+        <w:tc>
+          <w:tcPr>
+            <w:tcW w:type="dxa" w:w="3312"/>
+            <w:shd w:fill="E8F5E9"/>
+          </w:tcPr>
+          <w:p>
+            <w:r>
+              <w:rPr>
+                <w:b/>
+              </w:rPr>
+              <w:t>Evaluator Impact &amp; Features</w:t>
+            </w:r>
+          </w:p>
+        </w:tc>
+      </w:tr>
+      <w:tr>
+        <w:tc>
+          <w:tcPr>
+            <w:tcW w:type="dxa" w:w="3168"/>
+          </w:tcPr>
+          <w:p>
+            <w:r>
+              <w:rPr>
+                <w:b/>
+              </w:rPr>
+              <w:t>1. Landing Explainer &amp; 1-Click Test Chips</w:t>
+            </w:r>
+          </w:p>
+        </w:tc>
+        <w:tc>
+          <w:tcPr>
+            <w:tcW w:type="dxa" w:w="2880"/>
+          </w:tcPr>
+          <w:p>
+            <w:r>
+              <w:t>screenshots/01_landing_page.png</w:t>
+            </w:r>
+          </w:p>
+        </w:tc>
+        <w:tc>
+          <w:tcPr>
+            <w:tcW w:type="dxa" w:w="3312"/>
+          </w:tcPr>
+          <w:p>
+            <w:r>
+              <w:t>3 explainer cards (Grounded in FAO/IPCC, Multi-Metric Causal Graph, Validated Not Generic), interactive 5-slot category bar, and 1-click test scenario chips.</w:t>
+            </w:r>
+          </w:p>
+        </w:tc>
+      </w:tr>
+      <w:tr>
+        <w:tc>
+          <w:tcPr>
+            <w:tcW w:type="dxa" w:w="3168"/>
+          </w:tcPr>
+          <w:p>
+            <w:r>
+              <w:rPr>
+                <w:b/>
+              </w:rPr>
+              <w:t>2. Field Report Card with Causal Trail</w:t>
+            </w:r>
+          </w:p>
+        </w:tc>
+        <w:tc>
+          <w:tcPr>
+            <w:tcW w:type="dxa" w:w="2880"/>
+          </w:tcPr>
+          <w:p>
+            <w:r>
+              <w:t>screenshots/02_advisory_field_report.png</w:t>
+            </w:r>
+          </w:p>
+        </w:tc>
+        <w:tc>
+          <w:tcPr>
+            <w:tcW w:type="dxa" w:w="3312"/>
+          </w:tcPr>
+          <w:p>
+            <w:r>
+              <w:t>Multi-metric recommendation card with semantic confidence badge, 'Why this matters' line, causal pathway trail pills, operational trade-offs, and 1-click .md advisory report export.</w:t>
+            </w:r>
+          </w:p>
+        </w:tc>
+      </w:tr>
+      <w:tr>
+        <w:tc>
+          <w:tcPr>
+            <w:tcW w:type="dxa" w:w="3168"/>
+          </w:tcPr>
+          <w:p>
+            <w:r>
+              <w:rPr>
+                <w:b/>
+              </w:rPr>
+              <w:t>3. Grounded Retrieval Detail &amp; Provenance</w:t>
+            </w:r>
+          </w:p>
+        </w:tc>
+        <w:tc>
+          <w:tcPr>
+            <w:tcW w:type="dxa" w:w="2880"/>
+          </w:tcPr>
+          <w:p>
+            <w:r>
+              <w:t>screenshots/03_retrieval_evidence_detail.png</w:t>
+            </w:r>
+          </w:p>
+        </w:tc>
+        <w:tc>
+          <w:tcPr>
+            <w:tcW w:type="dxa" w:w="3312"/>
+          </w:tcPr>
+          <w:p>
+            <w:r>
+              <w:t>Inspectable ChromaDB audit expander displaying document IDs, exact cosine similarities (e.g. 0.794, 0.788), chunk excerpts, and supported recommendation provenance.</w:t>
+            </w:r>
+          </w:p>
+        </w:tc>
+      </w:tr>
+      <w:tr>
+        <w:tc>
+          <w:tcPr>
+            <w:tcW w:type="dxa" w:w="3168"/>
+          </w:tcPr>
+          <w:p>
+            <w:r>
+              <w:rPr>
+                <w:b/>
+              </w:rPr>
+              <w:t>4. Scenario Comparison ('Try Changing One Variable')</w:t>
+            </w:r>
+          </w:p>
+        </w:tc>
+        <w:tc>
+          <w:tcPr>
+            <w:tcW w:type="dxa" w:w="2880"/>
+          </w:tcPr>
+          <w:p>
+            <w:r>
+              <w:t>screenshots/04_scenario_comparison.png</w:t>
+            </w:r>
+          </w:p>
+        </w:tc>
+        <w:tc>
+          <w:tcPr>
+            <w:tcW w:type="dxa" w:w="3312"/>
+          </w:tcPr>
+          <w:p>
+            <w:r>
+              <w:t>Side-by-side sensitivity workstation comparing baseline and perturbed environmental regimes in real-time to observe dynamic causal graph adaptation.</w:t>
+            </w:r>
+          </w:p>
+        </w:tc>
+      </w:tr>
+      <w:tr>
+        <w:tc>
+          <w:tcPr>
+            <w:tcW w:type="dxa" w:w="3168"/>
+          </w:tcPr>
+          <w:p>
+            <w:r>
+              <w:rPr>
+                <w:b/>
+              </w:rPr>
+              <w:t>5. Clarifying Inquiry Flow</w:t>
+            </w:r>
+          </w:p>
+        </w:tc>
+        <w:tc>
+          <w:tcPr>
+            <w:tcW w:type="dxa" w:w="2880"/>
+          </w:tcPr>
+          <w:p>
+            <w:r>
+              <w:t>screenshots/05_clarifying_questions.png</w:t>
+            </w:r>
+          </w:p>
+        </w:tc>
+        <w:tc>
+          <w:tcPr>
+            <w:tcW w:type="dxa" w:w="3312"/>
+          </w:tcPr>
+          <w:p>
+            <w:r>
+              <w:t>Warm blue informational card asking targeted clarifying questions with discrete parameter buttons when incomplete or vague inputs are supplied.</w:t>
+            </w:r>
+          </w:p>
+        </w:tc>
+      </w:tr>
+    </w:tbl>
+    <w:p>
+      <w:pPr>
+        <w:pStyle w:val="Heading1"/>
+      </w:pPr>
+      <w:r>
+        <w:rPr>
+          <w:color w:val="186E32"/>
+        </w:rPr>
+        <w:t>7. Architecture, Database/Schema, Local Setup &amp; CI/CD</w:t>
       </w:r>
     </w:p>
     <w:p>
       <w:r>
-        <w:t>1. Clone repository:</w:t>
+        <w:t>• Database / Vector Schema:</w:t>
         <w:br/>
-        <w:t xml:space="preserve">   git clone https://github.com/[YOUR_USERNAME]/ecosage.git</w:t>
+        <w:t xml:space="preserve">  - ChromaDB Collection: 'ecosage_knowledge' (60 vector chunks, embedded via gemini-embedding-001 with 768-dim vectors).</w:t>
         <w:br/>
-        <w:t xml:space="preserve">   cd ecosage</w:t>
+        <w:t xml:space="preserve">  - Metadata Fields: document_id, source_name, section_title, target_metrics, chunk_index.</w:t>
+        <w:br/>
+        <w:t xml:space="preserve">  - Reference Benchmark Tables: JSON schemas in corpus/tables/ for SOC % benchmarks by biome, species richness baselines, and rainfall modifiers.</w:t>
         <w:br/>
         <w:br/>
-        <w:t>2. Install dependencies:</w:t>
+        <w:t>• CI/CD Pipeline (.github/workflows/ci.yml):</w:t>
         <w:br/>
-        <w:t xml:space="preserve">   pip install -r requirements.txt</w:t>
+        <w:t xml:space="preserve">  - Multi-OS, multi-Python matrix testing across Python 3.11, 3.12, 3.13, and 3.14.</w:t>
+        <w:br/>
+        <w:t xml:space="preserve">  - Automated Ruff linter check + full Pytest suite execution on every pull request and push to main.</w:t>
+        <w:br/>
+        <w:t xml:space="preserve">  - Standalone HTML test report artifact generated and uploaded on every build for reviewer auditability.</w:t>
         <w:br/>
         <w:br/>
-        <w:t>3. Configure API Key in .env:</w:t>
+        <w:t>• Windows One-Click Quickstart (run.bat):</w:t>
         <w:br/>
-        <w:t xml:space="preserve">   GOOGLE_API_KEY=your_free_gemini_api_key</w:t>
+        <w:t xml:space="preserve">  - Simply double-click 'run.bat' for an interactive menu:</w:t>
         <w:br/>
-        <w:t xml:space="preserve">   (Get a free key in 30 seconds at aistudio.google.com with any Google account)</w:t>
+        <w:t xml:space="preserve">    [1] Streamlit UI (Frontend Dashboard)</w:t>
+        <w:br/>
+        <w:t xml:space="preserve">    [2] Full Stack (FastAPI Backend + Streamlit UI)</w:t>
+        <w:br/>
+        <w:t xml:space="preserve">    [3] Launch FastAPI Backend Server Only (Port 8000)</w:t>
+        <w:br/>
+        <w:t xml:space="preserve">    [4] Ingest Knowledge Base into ChromaDB</w:t>
+        <w:br/>
+        <w:t xml:space="preserve">    [5] Run Full 140-Test Suite</w:t>
+        <w:br/>
+        <w:t xml:space="preserve">    [6] Run Code Quality Check (Ruff Linter)</w:t>
         <w:br/>
         <w:br/>
-        <w:t>4. Ingest Knowledge Base:</w:t>
+        <w:t>• Manual Command Line Setup:</w:t>
         <w:br/>
-        <w:t xml:space="preserve">   python -m ecosage.ingest</w:t>
+        <w:t xml:space="preserve">  1. git clone &lt;YOUR_REPO_URL&gt; &amp;&amp; cd ecosage</w:t>
         <w:br/>
+        <w:t xml:space="preserve">  2. pip install -r requirements.txt</w:t>
         <w:br/>
-        <w:t>5. Run the Automated Test Suite:</w:t>
+        <w:t xml:space="preserve">  3. copy .env.example .env (add free GOOGLE_API_KEY from aistudio.google.com)</w:t>
         <w:br/>
-        <w:t xml:space="preserve">   pytest tests/test_validator.py tests/test_acceptance.py -v</w:t>
+        <w:t xml:space="preserve">  4. python -m ecosage.ingest</w:t>
         <w:br/>
+        <w:t xml:space="preserve">  5. pytest -v  (Runs all 140 tests)</w:t>
         <w:br/>
-        <w:t>6. Launch FastAPI Backend:</w:t>
-        <w:br/>
-        <w:t xml:space="preserve">   uvicorn ecosage.api:app --reload --port 8000</w:t>
-        <w:br/>
-        <w:br/>
-        <w:t>7. Launch Streamlit UI (in separate terminal):</w:t>
-        <w:br/>
-        <w:t xml:space="preserve">   streamlit run ui/app.py</w:t>
+        <w:t xml:space="preserve">  6. streamlit run ui/app.py</w:t>
       </w:r>
     </w:p>
     <w:sectPr>

</xml_diff>

<commit_message>
docs: generate humanized Word submission doc with embedded screenshots and candidate contact details
</commit_message>
<xml_diff>
--- a/EcoSage_Hackathon_Submission.docx
+++ b/EcoSage_Hackathon_Submission.docx
@@ -66,7 +66,38 @@
               <w:rPr>
                 <w:sz w:val="19"/>
               </w:rPr>
-              <w:t>Radheya Shetty</w:t>
+              <w:t>Radheya Shetty (NMIMS Mumbai)</w:t>
+            </w:r>
+          </w:p>
+        </w:tc>
+      </w:tr>
+      <w:tr>
+        <w:tc>
+          <w:tcPr>
+            <w:tcW w:type="dxa" w:w="3168"/>
+            <w:shd w:fill="F0F4F1"/>
+          </w:tcPr>
+          <w:p>
+            <w:r>
+              <w:rPr>
+                <w:b/>
+                <w:sz w:val="19"/>
+              </w:rPr>
+              <w:t>Primary Contact Email:</w:t>
+            </w:r>
+          </w:p>
+        </w:tc>
+        <w:tc>
+          <w:tcPr>
+            <w:tcW w:type="dxa" w:w="6192"/>
+            <w:shd w:fill="FFFFFF"/>
+          </w:tcPr>
+          <w:p>
+            <w:r>
+              <w:rPr>
+                <w:sz w:val="19"/>
+              </w:rPr>
+              <w:t>radheya.shetty214@nmims.in</w:t>
             </w:r>
           </w:p>
         </w:tc>
@@ -1606,6 +1637,282 @@
     </w:tbl>
     <w:p>
       <w:pPr>
+        <w:spacing w:before="160"/>
+      </w:pPr>
+    </w:p>
+    <w:p>
+      <w:pPr>
+        <w:pStyle w:val="Heading2"/>
+      </w:pPr>
+      <w:r>
+        <w:rPr>
+          <w:color w:val="285078"/>
+        </w:rPr>
+        <w:t>6.1 Visual Workstation Screen Captures</w:t>
+      </w:r>
+    </w:p>
+    <w:p>
+      <w:pPr>
+        <w:spacing w:before="160" w:after="40"/>
+      </w:pPr>
+      <w:r>
+        <w:drawing>
+          <wp:inline xmlns:a="http://schemas.openxmlformats.org/drawingml/2006/main" xmlns:pic="http://schemas.openxmlformats.org/drawingml/2006/picture">
+            <wp:extent cx="5486400" cy="3181646"/>
+            <wp:docPr id="1" name="Picture 1"/>
+            <wp:cNvGraphicFramePr>
+              <a:graphicFrameLocks noChangeAspect="1"/>
+            </wp:cNvGraphicFramePr>
+            <a:graphic>
+              <a:graphicData uri="http://schemas.openxmlformats.org/drawingml/2006/picture">
+                <pic:pic>
+                  <pic:nvPicPr>
+                    <pic:cNvPr id="0" name="01_landing_page.png"/>
+                    <pic:cNvPicPr/>
+                  </pic:nvPicPr>
+                  <pic:blipFill>
+                    <a:blip r:embed="rId9"/>
+                    <a:stretch>
+                      <a:fillRect/>
+                    </a:stretch>
+                  </pic:blipFill>
+                  <pic:spPr>
+                    <a:xfrm>
+                      <a:off x="0" y="0"/>
+                      <a:ext cx="5486400" cy="3181646"/>
+                    </a:xfrm>
+                    <a:prstGeom prst="rect"/>
+                  </pic:spPr>
+                </pic:pic>
+              </a:graphicData>
+            </a:graphic>
+          </wp:inline>
+        </w:drawing>
+      </w:r>
+    </w:p>
+    <w:p>
+      <w:pPr>
+        <w:spacing w:after="200"/>
+      </w:pPr>
+      <w:r>
+        <w:rPr>
+          <w:i/>
+          <w:color w:val="6B7280"/>
+          <w:sz w:val="17"/>
+        </w:rPr>
+        <w:t>Figure 1: Workstation Landing Page with 3 Explainer Cards, 5-Slot Category Bar, and 1-Click Evaluation Chips.</w:t>
+      </w:r>
+    </w:p>
+    <w:p>
+      <w:pPr>
+        <w:spacing w:before="160" w:after="40"/>
+      </w:pPr>
+      <w:r>
+        <w:drawing>
+          <wp:inline xmlns:a="http://schemas.openxmlformats.org/drawingml/2006/main" xmlns:pic="http://schemas.openxmlformats.org/drawingml/2006/picture">
+            <wp:extent cx="5486400" cy="3181646"/>
+            <wp:docPr id="2" name="Picture 2"/>
+            <wp:cNvGraphicFramePr>
+              <a:graphicFrameLocks noChangeAspect="1"/>
+            </wp:cNvGraphicFramePr>
+            <a:graphic>
+              <a:graphicData uri="http://schemas.openxmlformats.org/drawingml/2006/picture">
+                <pic:pic>
+                  <pic:nvPicPr>
+                    <pic:cNvPr id="0" name="02_advisory_field_report.png"/>
+                    <pic:cNvPicPr/>
+                  </pic:nvPicPr>
+                  <pic:blipFill>
+                    <a:blip r:embed="rId10"/>
+                    <a:stretch>
+                      <a:fillRect/>
+                    </a:stretch>
+                  </pic:blipFill>
+                  <pic:spPr>
+                    <a:xfrm>
+                      <a:off x="0" y="0"/>
+                      <a:ext cx="5486400" cy="3181646"/>
+                    </a:xfrm>
+                    <a:prstGeom prst="rect"/>
+                  </pic:spPr>
+                </pic:pic>
+              </a:graphicData>
+            </a:graphic>
+          </wp:inline>
+        </w:drawing>
+      </w:r>
+    </w:p>
+    <w:p>
+      <w:pPr>
+        <w:spacing w:after="200"/>
+      </w:pPr>
+      <w:r>
+        <w:rPr>
+          <w:i/>
+          <w:color w:val="6B7280"/>
+          <w:sz w:val="17"/>
+        </w:rPr>
+        <w:t>Figure 2: Grounded Advisory Field Report Card with Semantic Badges, 'Why this matters', Causal Traversal Chips, and Trade-offs.</w:t>
+      </w:r>
+    </w:p>
+    <w:p>
+      <w:pPr>
+        <w:spacing w:before="160" w:after="40"/>
+      </w:pPr>
+      <w:r>
+        <w:drawing>
+          <wp:inline xmlns:a="http://schemas.openxmlformats.org/drawingml/2006/main" xmlns:pic="http://schemas.openxmlformats.org/drawingml/2006/picture">
+            <wp:extent cx="5486400" cy="3181646"/>
+            <wp:docPr id="3" name="Picture 3"/>
+            <wp:cNvGraphicFramePr>
+              <a:graphicFrameLocks noChangeAspect="1"/>
+            </wp:cNvGraphicFramePr>
+            <a:graphic>
+              <a:graphicData uri="http://schemas.openxmlformats.org/drawingml/2006/picture">
+                <pic:pic>
+                  <pic:nvPicPr>
+                    <pic:cNvPr id="0" name="03_retrieval_evidence_detail.png"/>
+                    <pic:cNvPicPr/>
+                  </pic:nvPicPr>
+                  <pic:blipFill>
+                    <a:blip r:embed="rId11"/>
+                    <a:stretch>
+                      <a:fillRect/>
+                    </a:stretch>
+                  </pic:blipFill>
+                  <pic:spPr>
+                    <a:xfrm>
+                      <a:off x="0" y="0"/>
+                      <a:ext cx="5486400" cy="3181646"/>
+                    </a:xfrm>
+                    <a:prstGeom prst="rect"/>
+                  </pic:spPr>
+                </pic:pic>
+              </a:graphicData>
+            </a:graphic>
+          </wp:inline>
+        </w:drawing>
+      </w:r>
+    </w:p>
+    <w:p>
+      <w:pPr>
+        <w:spacing w:after="200"/>
+      </w:pPr>
+      <w:r>
+        <w:rPr>
+          <w:i/>
+          <w:color w:val="6B7280"/>
+          <w:sz w:val="17"/>
+        </w:rPr>
+        <w:t>Figure 3: ChromaDB Retrieval Provenance Audit Expander displaying Document IDs, Cosine Similarities, and Supported Recommendations.</w:t>
+      </w:r>
+    </w:p>
+    <w:p>
+      <w:pPr>
+        <w:spacing w:before="160" w:after="40"/>
+      </w:pPr>
+      <w:r>
+        <w:drawing>
+          <wp:inline xmlns:a="http://schemas.openxmlformats.org/drawingml/2006/main" xmlns:pic="http://schemas.openxmlformats.org/drawingml/2006/picture">
+            <wp:extent cx="5486400" cy="3181646"/>
+            <wp:docPr id="4" name="Picture 4"/>
+            <wp:cNvGraphicFramePr>
+              <a:graphicFrameLocks noChangeAspect="1"/>
+            </wp:cNvGraphicFramePr>
+            <a:graphic>
+              <a:graphicData uri="http://schemas.openxmlformats.org/drawingml/2006/picture">
+                <pic:pic>
+                  <pic:nvPicPr>
+                    <pic:cNvPr id="0" name="04_scenario_comparison.png"/>
+                    <pic:cNvPicPr/>
+                  </pic:nvPicPr>
+                  <pic:blipFill>
+                    <a:blip r:embed="rId12"/>
+                    <a:stretch>
+                      <a:fillRect/>
+                    </a:stretch>
+                  </pic:blipFill>
+                  <pic:spPr>
+                    <a:xfrm>
+                      <a:off x="0" y="0"/>
+                      <a:ext cx="5486400" cy="3181646"/>
+                    </a:xfrm>
+                    <a:prstGeom prst="rect"/>
+                  </pic:spPr>
+                </pic:pic>
+              </a:graphicData>
+            </a:graphic>
+          </wp:inline>
+        </w:drawing>
+      </w:r>
+    </w:p>
+    <w:p>
+      <w:pPr>
+        <w:spacing w:after="200"/>
+      </w:pPr>
+      <w:r>
+        <w:rPr>
+          <w:i/>
+          <w:color w:val="6B7280"/>
+          <w:sz w:val="17"/>
+        </w:rPr>
+        <w:t>Figure 4: Parameter Sensitivity Analysis ('Try Changing One Variable') executing live dual-scenario comparison.</w:t>
+      </w:r>
+    </w:p>
+    <w:p>
+      <w:pPr>
+        <w:spacing w:before="160" w:after="40"/>
+      </w:pPr>
+      <w:r>
+        <w:drawing>
+          <wp:inline xmlns:a="http://schemas.openxmlformats.org/drawingml/2006/main" xmlns:pic="http://schemas.openxmlformats.org/drawingml/2006/picture">
+            <wp:extent cx="5486400" cy="3181646"/>
+            <wp:docPr id="5" name="Picture 5"/>
+            <wp:cNvGraphicFramePr>
+              <a:graphicFrameLocks noChangeAspect="1"/>
+            </wp:cNvGraphicFramePr>
+            <a:graphic>
+              <a:graphicData uri="http://schemas.openxmlformats.org/drawingml/2006/picture">
+                <pic:pic>
+                  <pic:nvPicPr>
+                    <pic:cNvPr id="0" name="05_clarifying_questions.png"/>
+                    <pic:cNvPicPr/>
+                  </pic:nvPicPr>
+                  <pic:blipFill>
+                    <a:blip r:embed="rId13"/>
+                    <a:stretch>
+                      <a:fillRect/>
+                    </a:stretch>
+                  </pic:blipFill>
+                  <pic:spPr>
+                    <a:xfrm>
+                      <a:off x="0" y="0"/>
+                      <a:ext cx="5486400" cy="3181646"/>
+                    </a:xfrm>
+                    <a:prstGeom prst="rect"/>
+                  </pic:spPr>
+                </pic:pic>
+              </a:graphicData>
+            </a:graphic>
+          </wp:inline>
+        </w:drawing>
+      </w:r>
+    </w:p>
+    <w:p>
+      <w:pPr>
+        <w:spacing w:after="200"/>
+      </w:pPr>
+      <w:r>
+        <w:rPr>
+          <w:i/>
+          <w:color w:val="6B7280"/>
+          <w:sz w:val="17"/>
+        </w:rPr>
+        <w:t>Figure 5: Conversational Clarifying Flow asking targeted questions with interactive discrete parameter buttons.</w:t>
+      </w:r>
+    </w:p>
+    <w:p>
+      <w:pPr>
         <w:pStyle w:val="Heading1"/>
       </w:pPr>
       <w:r>

</xml_diff>

<commit_message>
docs: optimize submission docx to 318KB (well under 500KB limit) while preserving all figures and text
</commit_message>
<xml_diff>
--- a/EcoSage_Hackathon_Submission.docx
+++ b/EcoSage_Hackathon_Submission.docx
@@ -1658,7 +1658,7 @@
       <w:r>
         <w:drawing>
           <wp:inline xmlns:a="http://schemas.openxmlformats.org/drawingml/2006/main" xmlns:pic="http://schemas.openxmlformats.org/drawingml/2006/picture">
-            <wp:extent cx="5486400" cy="3181646"/>
+            <wp:extent cx="5486400" cy="3177124"/>
             <wp:docPr id="1" name="Picture 1"/>
             <wp:cNvGraphicFramePr>
               <a:graphicFrameLocks noChangeAspect="1"/>
@@ -1667,7 +1667,7 @@
               <a:graphicData uri="http://schemas.openxmlformats.org/drawingml/2006/picture">
                 <pic:pic>
                   <pic:nvPicPr>
-                    <pic:cNvPr id="0" name="01_landing_page.png"/>
+                    <pic:cNvPr id="0" name="image.jpg"/>
                     <pic:cNvPicPr/>
                   </pic:nvPicPr>
                   <pic:blipFill>
@@ -1679,7 +1679,7 @@
                   <pic:spPr>
                     <a:xfrm>
                       <a:off x="0" y="0"/>
-                      <a:ext cx="5486400" cy="3181646"/>
+                      <a:ext cx="5486400" cy="3177124"/>
                     </a:xfrm>
                     <a:prstGeom prst="rect"/>
                   </pic:spPr>
@@ -1710,7 +1710,7 @@
       <w:r>
         <w:drawing>
           <wp:inline xmlns:a="http://schemas.openxmlformats.org/drawingml/2006/main" xmlns:pic="http://schemas.openxmlformats.org/drawingml/2006/picture">
-            <wp:extent cx="5486400" cy="3181646"/>
+            <wp:extent cx="5486400" cy="3177124"/>
             <wp:docPr id="2" name="Picture 2"/>
             <wp:cNvGraphicFramePr>
               <a:graphicFrameLocks noChangeAspect="1"/>
@@ -1719,7 +1719,7 @@
               <a:graphicData uri="http://schemas.openxmlformats.org/drawingml/2006/picture">
                 <pic:pic>
                   <pic:nvPicPr>
-                    <pic:cNvPr id="0" name="02_advisory_field_report.png"/>
+                    <pic:cNvPr id="0" name="image.jpg"/>
                     <pic:cNvPicPr/>
                   </pic:nvPicPr>
                   <pic:blipFill>
@@ -1731,7 +1731,7 @@
                   <pic:spPr>
                     <a:xfrm>
                       <a:off x="0" y="0"/>
-                      <a:ext cx="5486400" cy="3181646"/>
+                      <a:ext cx="5486400" cy="3177124"/>
                     </a:xfrm>
                     <a:prstGeom prst="rect"/>
                   </pic:spPr>
@@ -1762,7 +1762,7 @@
       <w:r>
         <w:drawing>
           <wp:inline xmlns:a="http://schemas.openxmlformats.org/drawingml/2006/main" xmlns:pic="http://schemas.openxmlformats.org/drawingml/2006/picture">
-            <wp:extent cx="5486400" cy="3181646"/>
+            <wp:extent cx="5486400" cy="3177124"/>
             <wp:docPr id="3" name="Picture 3"/>
             <wp:cNvGraphicFramePr>
               <a:graphicFrameLocks noChangeAspect="1"/>
@@ -1771,7 +1771,7 @@
               <a:graphicData uri="http://schemas.openxmlformats.org/drawingml/2006/picture">
                 <pic:pic>
                   <pic:nvPicPr>
-                    <pic:cNvPr id="0" name="03_retrieval_evidence_detail.png"/>
+                    <pic:cNvPr id="0" name="image.jpg"/>
                     <pic:cNvPicPr/>
                   </pic:nvPicPr>
                   <pic:blipFill>
@@ -1783,7 +1783,7 @@
                   <pic:spPr>
                     <a:xfrm>
                       <a:off x="0" y="0"/>
-                      <a:ext cx="5486400" cy="3181646"/>
+                      <a:ext cx="5486400" cy="3177124"/>
                     </a:xfrm>
                     <a:prstGeom prst="rect"/>
                   </pic:spPr>
@@ -1814,7 +1814,7 @@
       <w:r>
         <w:drawing>
           <wp:inline xmlns:a="http://schemas.openxmlformats.org/drawingml/2006/main" xmlns:pic="http://schemas.openxmlformats.org/drawingml/2006/picture">
-            <wp:extent cx="5486400" cy="3181646"/>
+            <wp:extent cx="5486400" cy="3177124"/>
             <wp:docPr id="4" name="Picture 4"/>
             <wp:cNvGraphicFramePr>
               <a:graphicFrameLocks noChangeAspect="1"/>
@@ -1823,7 +1823,7 @@
               <a:graphicData uri="http://schemas.openxmlformats.org/drawingml/2006/picture">
                 <pic:pic>
                   <pic:nvPicPr>
-                    <pic:cNvPr id="0" name="04_scenario_comparison.png"/>
+                    <pic:cNvPr id="0" name="image.jpg"/>
                     <pic:cNvPicPr/>
                   </pic:nvPicPr>
                   <pic:blipFill>
@@ -1835,7 +1835,7 @@
                   <pic:spPr>
                     <a:xfrm>
                       <a:off x="0" y="0"/>
-                      <a:ext cx="5486400" cy="3181646"/>
+                      <a:ext cx="5486400" cy="3177124"/>
                     </a:xfrm>
                     <a:prstGeom prst="rect"/>
                   </pic:spPr>
@@ -1866,7 +1866,7 @@
       <w:r>
         <w:drawing>
           <wp:inline xmlns:a="http://schemas.openxmlformats.org/drawingml/2006/main" xmlns:pic="http://schemas.openxmlformats.org/drawingml/2006/picture">
-            <wp:extent cx="5486400" cy="3181646"/>
+            <wp:extent cx="5486400" cy="3177124"/>
             <wp:docPr id="5" name="Picture 5"/>
             <wp:cNvGraphicFramePr>
               <a:graphicFrameLocks noChangeAspect="1"/>
@@ -1875,7 +1875,7 @@
               <a:graphicData uri="http://schemas.openxmlformats.org/drawingml/2006/picture">
                 <pic:pic>
                   <pic:nvPicPr>
-                    <pic:cNvPr id="0" name="05_clarifying_questions.png"/>
+                    <pic:cNvPr id="0" name="image.jpg"/>
                     <pic:cNvPicPr/>
                   </pic:nvPicPr>
                   <pic:blipFill>
@@ -1887,7 +1887,7 @@
                   <pic:spPr>
                     <a:xfrm>
                       <a:off x="0" y="0"/>
-                      <a:ext cx="5486400" cy="3181646"/>
+                      <a:ext cx="5486400" cy="3177124"/>
                     </a:xfrm>
                     <a:prstGeom prst="rect"/>
                   </pic:spPr>

</xml_diff>

<commit_message>
docs: refresh high-resolution website screenshots, animated walkthrough video, and submission doc
</commit_message>
<xml_diff>
--- a/EcoSage_Hackathon_Submission.docx
+++ b/EcoSage_Hackathon_Submission.docx
@@ -1658,7 +1658,7 @@
       <w:r>
         <w:drawing>
           <wp:inline xmlns:a="http://schemas.openxmlformats.org/drawingml/2006/main" xmlns:pic="http://schemas.openxmlformats.org/drawingml/2006/picture">
-            <wp:extent cx="5486400" cy="3177124"/>
+            <wp:extent cx="5486400" cy="3117273"/>
             <wp:docPr id="1" name="Picture 1"/>
             <wp:cNvGraphicFramePr>
               <a:graphicFrameLocks noChangeAspect="1"/>
@@ -1679,7 +1679,7 @@
                   <pic:spPr>
                     <a:xfrm>
                       <a:off x="0" y="0"/>
-                      <a:ext cx="5486400" cy="3177124"/>
+                      <a:ext cx="5486400" cy="3117273"/>
                     </a:xfrm>
                     <a:prstGeom prst="rect"/>
                   </pic:spPr>
@@ -1710,7 +1710,7 @@
       <w:r>
         <w:drawing>
           <wp:inline xmlns:a="http://schemas.openxmlformats.org/drawingml/2006/main" xmlns:pic="http://schemas.openxmlformats.org/drawingml/2006/picture">
-            <wp:extent cx="5486400" cy="3177124"/>
+            <wp:extent cx="5486400" cy="3117273"/>
             <wp:docPr id="2" name="Picture 2"/>
             <wp:cNvGraphicFramePr>
               <a:graphicFrameLocks noChangeAspect="1"/>
@@ -1731,7 +1731,7 @@
                   <pic:spPr>
                     <a:xfrm>
                       <a:off x="0" y="0"/>
-                      <a:ext cx="5486400" cy="3177124"/>
+                      <a:ext cx="5486400" cy="3117273"/>
                     </a:xfrm>
                     <a:prstGeom prst="rect"/>
                   </pic:spPr>
@@ -1762,7 +1762,7 @@
       <w:r>
         <w:drawing>
           <wp:inline xmlns:a="http://schemas.openxmlformats.org/drawingml/2006/main" xmlns:pic="http://schemas.openxmlformats.org/drawingml/2006/picture">
-            <wp:extent cx="5486400" cy="3177124"/>
+            <wp:extent cx="5486400" cy="3117273"/>
             <wp:docPr id="3" name="Picture 3"/>
             <wp:cNvGraphicFramePr>
               <a:graphicFrameLocks noChangeAspect="1"/>
@@ -1775,7 +1775,7 @@
                     <pic:cNvPicPr/>
                   </pic:nvPicPr>
                   <pic:blipFill>
-                    <a:blip r:embed="rId11"/>
+                    <a:blip r:embed="rId10"/>
                     <a:stretch>
                       <a:fillRect/>
                     </a:stretch>
@@ -1783,7 +1783,7 @@
                   <pic:spPr>
                     <a:xfrm>
                       <a:off x="0" y="0"/>
-                      <a:ext cx="5486400" cy="3177124"/>
+                      <a:ext cx="5486400" cy="3117273"/>
                     </a:xfrm>
                     <a:prstGeom prst="rect"/>
                   </pic:spPr>
@@ -1814,7 +1814,7 @@
       <w:r>
         <w:drawing>
           <wp:inline xmlns:a="http://schemas.openxmlformats.org/drawingml/2006/main" xmlns:pic="http://schemas.openxmlformats.org/drawingml/2006/picture">
-            <wp:extent cx="5486400" cy="3177124"/>
+            <wp:extent cx="5486400" cy="3117273"/>
             <wp:docPr id="4" name="Picture 4"/>
             <wp:cNvGraphicFramePr>
               <a:graphicFrameLocks noChangeAspect="1"/>
@@ -1827,7 +1827,7 @@
                     <pic:cNvPicPr/>
                   </pic:nvPicPr>
                   <pic:blipFill>
-                    <a:blip r:embed="rId12"/>
+                    <a:blip r:embed="rId11"/>
                     <a:stretch>
                       <a:fillRect/>
                     </a:stretch>
@@ -1835,7 +1835,7 @@
                   <pic:spPr>
                     <a:xfrm>
                       <a:off x="0" y="0"/>
-                      <a:ext cx="5486400" cy="3177124"/>
+                      <a:ext cx="5486400" cy="3117273"/>
                     </a:xfrm>
                     <a:prstGeom prst="rect"/>
                   </pic:spPr>
@@ -1866,7 +1866,7 @@
       <w:r>
         <w:drawing>
           <wp:inline xmlns:a="http://schemas.openxmlformats.org/drawingml/2006/main" xmlns:pic="http://schemas.openxmlformats.org/drawingml/2006/picture">
-            <wp:extent cx="5486400" cy="3177124"/>
+            <wp:extent cx="5486400" cy="3117273"/>
             <wp:docPr id="5" name="Picture 5"/>
             <wp:cNvGraphicFramePr>
               <a:graphicFrameLocks noChangeAspect="1"/>
@@ -1879,7 +1879,7 @@
                     <pic:cNvPicPr/>
                   </pic:nvPicPr>
                   <pic:blipFill>
-                    <a:blip r:embed="rId13"/>
+                    <a:blip r:embed="rId12"/>
                     <a:stretch>
                       <a:fillRect/>
                     </a:stretch>
@@ -1887,7 +1887,7 @@
                   <pic:spPr>
                     <a:xfrm>
                       <a:off x="0" y="0"/>
-                      <a:ext cx="5486400" cy="3177124"/>
+                      <a:ext cx="5486400" cy="3117273"/>
                     </a:xfrm>
                     <a:prstGeom prst="rect"/>
                   </pic:spPr>

</xml_diff>